<commit_message>
Complete report and final test results
</commit_message>
<xml_diff>
--- a/TangPiseth_Report_Finalized.docx
+++ b/TangPiseth_Report_Finalized.docx
@@ -12027,6 +12027,193 @@
         </w:tc>
       </w:tr>
     </w:tbl>
+    <w:p>
+      <w:pPr>
+        <w:rPr>
+          <w:b/>
+          <w:bCs/>
+          <w:sz w:val="40"/>
+          <w:szCs w:val="40"/>
+        </w:rPr>
+      </w:pPr>
+      <w:r>
+        <w:br/>
+      </w:r>
+      <w:r>
+        <w:br/>
+      </w:r>
+      <w:r>
+        <w:br/>
+      </w:r>
+      <w:r>
+        <w:br/>
+      </w:r>
+      <w:r>
+        <w:br/>
+      </w:r>
+      <w:r>
+        <w:br/>
+      </w:r>
+      <w:r>
+        <w:br/>
+      </w:r>
+      <w:r>
+        <w:lastRenderedPageBreak/>
+        <w:br/>
+      </w:r>
+      <w:r>
+        <w:rPr>
+          <w:b/>
+          <w:bCs/>
+          <w:sz w:val="40"/>
+          <w:szCs w:val="40"/>
+        </w:rPr>
+        <w:t>Submission Checklist</w:t>
+      </w:r>
+    </w:p>
+    <w:p>
+      <w:pPr>
+        <w:rPr>
+          <w:sz w:val="24"/>
+          <w:szCs w:val="24"/>
+        </w:rPr>
+      </w:pPr>
+      <w:r>
+        <w:rPr>
+          <w:sz w:val="24"/>
+          <w:szCs w:val="24"/>
+        </w:rPr>
+        <w:t>Tick each item before submitting:</w:t>
+      </w:r>
+    </w:p>
+    <w:p>
+      <w:r>
+        <w:rPr>
+          <w:rFonts w:ascii="Segoe UI Symbol" w:hAnsi="Segoe UI Symbol" w:cs="Segoe UI Symbol"/>
+        </w:rPr>
+        <w:t>☒</w:t>
+      </w:r>
+      <w:r>
+        <w:t xml:space="preserve"> Git history shows TDD commits (minimum 8 RED/GREEN/REFACTOR commits)</w:t>
+      </w:r>
+    </w:p>
+    <w:p>
+      <w:r>
+        <w:rPr>
+          <w:rFonts w:ascii="Segoe UI Symbol" w:hAnsi="Segoe UI Symbol" w:cs="Segoe UI Symbol"/>
+        </w:rPr>
+        <w:t>☒</w:t>
+      </w:r>
+      <w:r>
+        <w:t xml:space="preserve"> All tests pass (dotnet test output included above)</w:t>
+      </w:r>
+    </w:p>
+    <w:p>
+      <w:r>
+        <w:rPr>
+          <w:rFonts w:ascii="Segoe UI Symbol" w:hAnsi="Segoe UI Symbol" w:cs="Segoe UI Symbol"/>
+        </w:rPr>
+        <w:t>☒</w:t>
+      </w:r>
+      <w:r>
+        <w:t xml:space="preserve"> At least </w:t>
+      </w:r>
+      <w:proofErr w:type="gramStart"/>
+      <w:r>
+        <w:t>10 unit</w:t>
+      </w:r>
+      <w:proofErr w:type="gramEnd"/>
+      <w:r>
+        <w:t xml:space="preserve"> test scenarios for </w:t>
+      </w:r>
+      <w:proofErr w:type="spellStart"/>
+      <w:r>
+        <w:t>ParkingFeeCalculator</w:t>
+      </w:r>
+      <w:proofErr w:type="spellEnd"/>
+    </w:p>
+    <w:p>
+      <w:r>
+        <w:rPr>
+          <w:rFonts w:ascii="Segoe UI Symbol" w:hAnsi="Segoe UI Symbol" w:cs="Segoe UI Symbol"/>
+        </w:rPr>
+        <w:t>☒</w:t>
+      </w:r>
+      <w:r>
+        <w:t xml:space="preserve"> At least 5 test double scenarios for </w:t>
+      </w:r>
+      <w:proofErr w:type="spellStart"/>
+      <w:r>
+        <w:t>ParkingSessionManager</w:t>
+      </w:r>
+      <w:proofErr w:type="spellEnd"/>
+    </w:p>
+    <w:p>
+      <w:r>
+        <w:rPr>
+          <w:rFonts w:ascii="Segoe UI Symbol" w:hAnsi="Segoe UI Symbol" w:cs="Segoe UI Symbol"/>
+        </w:rPr>
+        <w:t>☒</w:t>
+      </w:r>
+      <w:r>
+        <w:t xml:space="preserve"> At least 5 property-based tests written with FsCheck</w:t>
+      </w:r>
+    </w:p>
+    <w:p>
+      <w:r>
+        <w:rPr>
+          <w:rFonts w:ascii="Segoe UI Symbol" w:hAnsi="Segoe UI Symbol" w:cs="Segoe UI Symbol"/>
+        </w:rPr>
+        <w:t>☒</w:t>
+      </w:r>
+      <w:r>
+        <w:t xml:space="preserve"> At least 5 integration test scenarios</w:t>
+      </w:r>
+    </w:p>
+    <w:p>
+      <w:r>
+        <w:rPr>
+          <w:rFonts w:ascii="Segoe UI Symbol" w:hAnsi="Segoe UI Symbol" w:cs="Segoe UI Symbol"/>
+        </w:rPr>
+        <w:t>☒</w:t>
+      </w:r>
+      <w:r>
+        <w:t xml:space="preserve"> Traceability matrix is complete (every business rule has at least one test)</w:t>
+      </w:r>
+    </w:p>
+    <w:p>
+      <w:r>
+        <w:rPr>
+          <w:rFonts w:ascii="Segoe UI Symbol" w:hAnsi="Segoe UI Symbol" w:cs="Segoe UI Symbol"/>
+        </w:rPr>
+        <w:t>☒</w:t>
+      </w:r>
+      <w:r>
+        <w:t xml:space="preserve"> Code coverage report included</w:t>
+      </w:r>
+    </w:p>
+    <w:p>
+      <w:r>
+        <w:rPr>
+          <w:rFonts w:ascii="Segoe UI Symbol" w:hAnsi="Segoe UI Symbol" w:cs="Segoe UI Symbol"/>
+        </w:rPr>
+        <w:t>☒</w:t>
+      </w:r>
+      <w:r>
+        <w:t xml:space="preserve"> Laptop ready for 1-on-1 demo (project builds, all tests pass)</w:t>
+      </w:r>
+    </w:p>
+    <w:p>
+      <w:r>
+        <w:rPr>
+          <w:rFonts w:ascii="Segoe UI Symbol" w:hAnsi="Segoe UI Symbol" w:cs="Segoe UI Symbol"/>
+        </w:rPr>
+        <w:t>☒</w:t>
+      </w:r>
+      <w:r>
+        <w:t xml:space="preserve"> All sections of this report are filled in</w:t>
+      </w:r>
+    </w:p>
     <w:p/>
     <w:sectPr>
       <w:pgSz w:w="12240" w:h="15840"/>
@@ -12441,7 +12628,6 @@
   <w:style w:type="character" w:default="1" w:styleId="DefaultParagraphFont">
     <w:name w:val="Default Paragraph Font"/>
     <w:uiPriority w:val="1"/>
-    <w:semiHidden/>
     <w:unhideWhenUsed/>
   </w:style>
   <w:style w:type="table" w:default="1" w:styleId="TableNormal">
@@ -12559,6 +12745,19 @@
       <w:rFonts w:ascii="Consolas" w:hAnsi="Consolas"/>
       <w:sz w:val="20"/>
       <w:szCs w:val="32"/>
+    </w:rPr>
+  </w:style>
+  <w:style w:type="paragraph" w:styleId="NormalWeb">
+    <w:name w:val="Normal (Web)"/>
+    <w:basedOn w:val="Normal"/>
+    <w:uiPriority w:val="99"/>
+    <w:semiHidden/>
+    <w:unhideWhenUsed/>
+    <w:rsid w:val="00AB6BED"/>
+    <w:rPr>
+      <w:rFonts w:ascii="Times New Roman" w:hAnsi="Times New Roman" w:cs="Times New Roman"/>
+      <w:sz w:val="24"/>
+      <w:szCs w:val="39"/>
     </w:rPr>
   </w:style>
 </w:styles>

</xml_diff>

<commit_message>
Finalize report with updated test results, coverage, and FsCheck output
</commit_message>
<xml_diff>
--- a/TangPiseth_Report_Finalized.docx
+++ b/TangPiseth_Report_Finalized.docx
@@ -6841,6 +6841,9 @@
         <w:gridCol w:w="9350"/>
       </w:tblGrid>
       <w:tr>
+        <w:trPr>
+          <w:trHeight w:val="3329"/>
+        </w:trPr>
         <w:tc>
           <w:tcPr>
             <w:tcW w:w="9350" w:type="dxa"/>
@@ -6894,7 +6897,7 @@
                 <w:sz w:val="20"/>
                 <w:szCs w:val="20"/>
               </w:rPr>
-              <w:t>Restore complete (0.9s)</w:t>
+              <w:t>Restore complete (1.0s)</w:t>
             </w:r>
           </w:p>
           <w:p>
@@ -6929,23 +6932,7 @@
                 <w:sz w:val="20"/>
                 <w:szCs w:val="20"/>
               </w:rPr>
-              <w:t xml:space="preserve"> net10.0 succeeded (0.2s) </w:t>
-            </w:r>
-            <w:r>
-              <w:rPr>
-                <w:rFonts w:ascii="Cambria" w:hAnsi="Cambria" w:cs="Times New Roman"/>
-                <w:sz w:val="20"/>
-                <w:szCs w:val="20"/>
-              </w:rPr>
-              <w:t>→</w:t>
-            </w:r>
-            <w:r>
-              <w:rPr>
-                <w:rFonts w:ascii="Cambria" w:hAnsi="Cambria"/>
-                <w:sz w:val="20"/>
-                <w:szCs w:val="20"/>
-              </w:rPr>
-              <w:t xml:space="preserve"> </w:t>
+              <w:t xml:space="preserve"> net10.0 succeeded (0.3s) → </w:t>
             </w:r>
             <w:proofErr w:type="spellStart"/>
             <w:r>
@@ -7016,23 +7003,7 @@
                 <w:sz w:val="20"/>
                 <w:szCs w:val="20"/>
               </w:rPr>
-              <w:t xml:space="preserve"> net10.0 succeeded (0.3s) </w:t>
-            </w:r>
-            <w:r>
-              <w:rPr>
-                <w:rFonts w:ascii="Cambria" w:hAnsi="Cambria" w:cs="Times New Roman"/>
-                <w:sz w:val="20"/>
-                <w:szCs w:val="20"/>
-              </w:rPr>
-              <w:t>→</w:t>
-            </w:r>
-            <w:r>
-              <w:rPr>
-                <w:rFonts w:ascii="Cambria" w:hAnsi="Cambria"/>
-                <w:sz w:val="20"/>
-                <w:szCs w:val="20"/>
-              </w:rPr>
-              <w:t xml:space="preserve"> tests\</w:t>
+              <w:t xml:space="preserve"> net10.0 succeeded (0.5s) → tests\</w:t>
             </w:r>
             <w:proofErr w:type="spellStart"/>
             <w:r>
@@ -7102,7 +7073,7 @@
                 <w:sz w:val="20"/>
                 <w:szCs w:val="20"/>
               </w:rPr>
-              <w:t xml:space="preserve">[xUnit.net 00:00:00.10]   Discovering: </w:t>
+              <w:t xml:space="preserve">[xUnit.net 00:00:00.12]   Discovering: </w:t>
             </w:r>
             <w:proofErr w:type="spellStart"/>
             <w:r>
@@ -7129,7 +7100,7 @@
                 <w:sz w:val="20"/>
                 <w:szCs w:val="20"/>
               </w:rPr>
-              <w:t>[xUnit.net 00:00:00.17]   Discovered</w:t>
+              <w:t>[xUnit.net 00:00:00.23]   Discovered</w:t>
             </w:r>
             <w:proofErr w:type="gramStart"/>
             <w:r>
@@ -7174,7 +7145,7 @@
                 <w:sz w:val="20"/>
                 <w:szCs w:val="20"/>
               </w:rPr>
-              <w:t xml:space="preserve">[xUnit.net 00:00:00.21]   Starting:    </w:t>
+              <w:t xml:space="preserve">[xUnit.net 00:00:00.29]   Starting:    </w:t>
             </w:r>
             <w:proofErr w:type="spellStart"/>
             <w:r>
@@ -7201,7 +7172,7 @@
                 <w:sz w:val="20"/>
                 <w:szCs w:val="20"/>
               </w:rPr>
-              <w:t xml:space="preserve">[xUnit.net 00:00:00.32]   Finished:    </w:t>
+              <w:t xml:space="preserve">[xUnit.net 00:00:00.75]   Finished:    </w:t>
             </w:r>
             <w:proofErr w:type="spellStart"/>
             <w:r>
@@ -7246,50 +7217,50 @@
                 <w:sz w:val="20"/>
                 <w:szCs w:val="20"/>
               </w:rPr>
-              <w:t xml:space="preserve"> test net10.0 succeeded (1.3s)</w:t>
-            </w:r>
-          </w:p>
-          <w:p>
-            <w:pPr>
-              <w:rPr>
-                <w:rFonts w:ascii="Cambria" w:hAnsi="Cambria"/>
-                <w:sz w:val="20"/>
-                <w:szCs w:val="20"/>
-              </w:rPr>
-            </w:pPr>
-          </w:p>
-          <w:p>
-            <w:pPr>
-              <w:rPr>
-                <w:rFonts w:ascii="Cambria" w:hAnsi="Cambria"/>
-                <w:sz w:val="20"/>
-                <w:szCs w:val="20"/>
-              </w:rPr>
-            </w:pPr>
-            <w:r>
-              <w:rPr>
-                <w:rFonts w:ascii="Cambria" w:hAnsi="Cambria"/>
-                <w:sz w:val="20"/>
-                <w:szCs w:val="20"/>
-              </w:rPr>
-              <w:t>Test summary: total: 12, failed: 0, succeeded: 12, skipped: 0, duration: 1.3s</w:t>
-            </w:r>
-          </w:p>
-          <w:p>
-            <w:pPr>
-              <w:rPr>
-                <w:rFonts w:ascii="Cambria" w:hAnsi="Cambria"/>
-                <w:sz w:val="20"/>
-                <w:szCs w:val="20"/>
-              </w:rPr>
-            </w:pPr>
-            <w:r>
-              <w:rPr>
-                <w:rFonts w:ascii="Cambria" w:hAnsi="Cambria"/>
-                <w:sz w:val="20"/>
-                <w:szCs w:val="20"/>
-              </w:rPr>
-              <w:t>Build succeeded in 3.0s</w:t>
+              <w:t xml:space="preserve"> test net10.0 succeeded (1.8s)</w:t>
+            </w:r>
+          </w:p>
+          <w:p>
+            <w:pPr>
+              <w:rPr>
+                <w:rFonts w:ascii="Cambria" w:hAnsi="Cambria"/>
+                <w:sz w:val="20"/>
+                <w:szCs w:val="20"/>
+              </w:rPr>
+            </w:pPr>
+          </w:p>
+          <w:p>
+            <w:pPr>
+              <w:rPr>
+                <w:rFonts w:ascii="Cambria" w:hAnsi="Cambria"/>
+                <w:sz w:val="20"/>
+                <w:szCs w:val="20"/>
+              </w:rPr>
+            </w:pPr>
+            <w:r>
+              <w:rPr>
+                <w:rFonts w:ascii="Cambria" w:hAnsi="Cambria"/>
+                <w:sz w:val="20"/>
+                <w:szCs w:val="20"/>
+              </w:rPr>
+              <w:t>Test summary: total: 17, failed: 0, succeeded: 17, skipped: 0, duration: 1.8s</w:t>
+            </w:r>
+          </w:p>
+          <w:p>
+            <w:pPr>
+              <w:rPr>
+                <w:rFonts w:ascii="Cambria" w:hAnsi="Cambria"/>
+                <w:sz w:val="20"/>
+                <w:szCs w:val="20"/>
+              </w:rPr>
+            </w:pPr>
+            <w:r>
+              <w:rPr>
+                <w:rFonts w:ascii="Cambria" w:hAnsi="Cambria"/>
+                <w:sz w:val="20"/>
+                <w:szCs w:val="20"/>
+              </w:rPr>
+              <w:t>Build succeeded in 3.8s</w:t>
             </w:r>
           </w:p>
         </w:tc>
@@ -7435,7 +7406,7 @@
                 <w:sz w:val="20"/>
                 <w:szCs w:val="20"/>
               </w:rPr>
-              <w:t>Restore complete (0.9s)</w:t>
+              <w:t>Restore complete (1.0s)</w:t>
             </w:r>
           </w:p>
           <w:p>
@@ -7470,23 +7441,7 @@
                 <w:sz w:val="20"/>
                 <w:szCs w:val="20"/>
               </w:rPr>
-              <w:t xml:space="preserve"> net10.0 succeeded (0.2s) </w:t>
-            </w:r>
-            <w:r>
-              <w:rPr>
-                <w:rFonts w:ascii="Cambria" w:hAnsi="Cambria" w:cs="Times New Roman"/>
-                <w:sz w:val="20"/>
-                <w:szCs w:val="20"/>
-              </w:rPr>
-              <w:t>→</w:t>
-            </w:r>
-            <w:r>
-              <w:rPr>
-                <w:rFonts w:ascii="Cambria" w:hAnsi="Cambria"/>
-                <w:sz w:val="20"/>
-                <w:szCs w:val="20"/>
-              </w:rPr>
-              <w:t xml:space="preserve"> </w:t>
+              <w:t xml:space="preserve"> net10.0 succeeded (0.2s) → </w:t>
             </w:r>
             <w:proofErr w:type="spellStart"/>
             <w:r>
@@ -7557,23 +7512,7 @@
                 <w:sz w:val="20"/>
                 <w:szCs w:val="20"/>
               </w:rPr>
-              <w:t xml:space="preserve"> net10.0 succeeded (0.3s) </w:t>
-            </w:r>
-            <w:r>
-              <w:rPr>
-                <w:rFonts w:ascii="Cambria" w:hAnsi="Cambria" w:cs="Times New Roman"/>
-                <w:sz w:val="20"/>
-                <w:szCs w:val="20"/>
-              </w:rPr>
-              <w:t>→</w:t>
-            </w:r>
-            <w:r>
-              <w:rPr>
-                <w:rFonts w:ascii="Cambria" w:hAnsi="Cambria"/>
-                <w:sz w:val="20"/>
-                <w:szCs w:val="20"/>
-              </w:rPr>
-              <w:t xml:space="preserve"> tests\</w:t>
+              <w:t xml:space="preserve"> net10.0 succeeded (0.2s) → tests\</w:t>
             </w:r>
             <w:proofErr w:type="spellStart"/>
             <w:r>
@@ -7643,7 +7582,7 @@
                 <w:sz w:val="20"/>
                 <w:szCs w:val="20"/>
               </w:rPr>
-              <w:t xml:space="preserve">[xUnit.net 00:00:00.11]   Discovering: </w:t>
+              <w:t xml:space="preserve">[xUnit.net 00:00:00.12]   Discovering: </w:t>
             </w:r>
             <w:proofErr w:type="spellStart"/>
             <w:r>
@@ -7670,7 +7609,7 @@
                 <w:sz w:val="20"/>
                 <w:szCs w:val="20"/>
               </w:rPr>
-              <w:t>[xUnit.net 00:00:00.17]   Discovered</w:t>
+              <w:t>[xUnit.net 00:00:00.19]   Discovered</w:t>
             </w:r>
             <w:proofErr w:type="gramStart"/>
             <w:r>
@@ -7715,7 +7654,7 @@
                 <w:sz w:val="20"/>
                 <w:szCs w:val="20"/>
               </w:rPr>
-              <w:t xml:space="preserve">[xUnit.net 00:00:00.20]   Starting:    </w:t>
+              <w:t xml:space="preserve">[xUnit.net 00:00:00.22]   Starting:    </w:t>
             </w:r>
             <w:proofErr w:type="spellStart"/>
             <w:r>
@@ -7742,7 +7681,7 @@
                 <w:sz w:val="20"/>
                 <w:szCs w:val="20"/>
               </w:rPr>
-              <w:t xml:space="preserve">[xUnit.net 00:00:00.35]   Finished:    </w:t>
+              <w:t xml:space="preserve">[xUnit.net 00:00:00.42]   Finished:    </w:t>
             </w:r>
             <w:proofErr w:type="spellStart"/>
             <w:r>
@@ -7787,50 +7726,50 @@
                 <w:sz w:val="20"/>
                 <w:szCs w:val="20"/>
               </w:rPr>
-              <w:t xml:space="preserve"> test net10.0 succeeded (1.4s)</w:t>
-            </w:r>
-          </w:p>
-          <w:p>
-            <w:pPr>
-              <w:rPr>
-                <w:rFonts w:ascii="Cambria" w:hAnsi="Cambria"/>
-                <w:sz w:val="20"/>
-                <w:szCs w:val="20"/>
-              </w:rPr>
-            </w:pPr>
-          </w:p>
-          <w:p>
-            <w:pPr>
-              <w:rPr>
-                <w:rFonts w:ascii="Cambria" w:hAnsi="Cambria"/>
-                <w:sz w:val="20"/>
-                <w:szCs w:val="20"/>
-              </w:rPr>
-            </w:pPr>
-            <w:r>
-              <w:rPr>
-                <w:rFonts w:ascii="Cambria" w:hAnsi="Cambria"/>
-                <w:sz w:val="20"/>
-                <w:szCs w:val="20"/>
-              </w:rPr>
-              <w:t>Test summary: total: 1, failed: 0, succeeded: 1, skipped: 0, duration: 1.3s</w:t>
-            </w:r>
-          </w:p>
-          <w:p>
-            <w:pPr>
-              <w:rPr>
-                <w:rFonts w:ascii="Cambria" w:hAnsi="Cambria"/>
-                <w:sz w:val="20"/>
-                <w:szCs w:val="20"/>
-              </w:rPr>
-            </w:pPr>
-            <w:r>
-              <w:rPr>
-                <w:rFonts w:ascii="Cambria" w:hAnsi="Cambria"/>
-                <w:sz w:val="20"/>
-                <w:szCs w:val="20"/>
-              </w:rPr>
-              <w:t>Build succeeded in 3.0s</w:t>
+              <w:t xml:space="preserve"> test net10.0 succeeded (1.5s)</w:t>
+            </w:r>
+          </w:p>
+          <w:p>
+            <w:pPr>
+              <w:rPr>
+                <w:rFonts w:ascii="Cambria" w:hAnsi="Cambria"/>
+                <w:sz w:val="20"/>
+                <w:szCs w:val="20"/>
+              </w:rPr>
+            </w:pPr>
+          </w:p>
+          <w:p>
+            <w:pPr>
+              <w:rPr>
+                <w:rFonts w:ascii="Cambria" w:hAnsi="Cambria"/>
+                <w:sz w:val="20"/>
+                <w:szCs w:val="20"/>
+              </w:rPr>
+            </w:pPr>
+            <w:r>
+              <w:rPr>
+                <w:rFonts w:ascii="Cambria" w:hAnsi="Cambria"/>
+                <w:sz w:val="20"/>
+                <w:szCs w:val="20"/>
+              </w:rPr>
+              <w:t>Test summary: total: 6, failed: 0, succeeded: 6, skipped: 0, duration: 1.5s</w:t>
+            </w:r>
+          </w:p>
+          <w:p>
+            <w:pPr>
+              <w:rPr>
+                <w:rFonts w:ascii="Cambria" w:hAnsi="Cambria"/>
+                <w:sz w:val="20"/>
+                <w:szCs w:val="20"/>
+              </w:rPr>
+            </w:pPr>
+            <w:r>
+              <w:rPr>
+                <w:rFonts w:ascii="Cambria" w:hAnsi="Cambria"/>
+                <w:sz w:val="20"/>
+                <w:szCs w:val="20"/>
+              </w:rPr>
+              <w:t>Build succeeded in 3.1s</w:t>
             </w:r>
           </w:p>
         </w:tc>
@@ -7908,11 +7847,19 @@
             </w:pPr>
             <w:r>
               <w:rPr>
-                <w:rFonts w:ascii="Cambria" w:hAnsi="Cambria"/>
-                <w:sz w:val="20"/>
-                <w:szCs w:val="20"/>
-              </w:rPr>
-              <w:t>PS D:\automate-test-ITE-E5-TangPiseth\automate-test-E5-TangPiseth&gt; dotnet test --filter "</w:t>
+                <w:rFonts w:ascii="Segoe UI Symbol" w:hAnsi="Segoe UI Symbol" w:cs="Segoe UI Symbol"/>
+                <w:sz w:val="20"/>
+                <w:szCs w:val="20"/>
+              </w:rPr>
+              <w:t>✓</w:t>
+            </w:r>
+            <w:r>
+              <w:rPr>
+                <w:rFonts w:ascii="Cambria" w:hAnsi="Cambria"/>
+                <w:sz w:val="20"/>
+                <w:szCs w:val="20"/>
+              </w:rPr>
+              <w:t xml:space="preserve"> </w:t>
             </w:r>
             <w:proofErr w:type="spellStart"/>
             <w:r>
@@ -7921,7 +7868,7 @@
                 <w:sz w:val="20"/>
                 <w:szCs w:val="20"/>
               </w:rPr>
-              <w:t>FullyQualifiedName~ParkingFeeCalculatorTests</w:t>
+              <w:t>GracePeriodIsAlwaysFree</w:t>
             </w:r>
             <w:proofErr w:type="spellEnd"/>
             <w:r>
@@ -7930,41 +7877,7 @@
                 <w:sz w:val="20"/>
                 <w:szCs w:val="20"/>
               </w:rPr>
-              <w:t>" --verbosity normal</w:t>
-            </w:r>
-          </w:p>
-          <w:p>
-            <w:pPr>
-              <w:rPr>
-                <w:rFonts w:ascii="Cambria" w:hAnsi="Cambria"/>
-                <w:sz w:val="20"/>
-                <w:szCs w:val="20"/>
-              </w:rPr>
-            </w:pPr>
-            <w:r>
-              <w:rPr>
-                <w:rFonts w:ascii="Cambria" w:hAnsi="Cambria"/>
-                <w:sz w:val="20"/>
-                <w:szCs w:val="20"/>
-              </w:rPr>
-              <w:t>Restore complete (0.9s)</w:t>
-            </w:r>
-          </w:p>
-          <w:p>
-            <w:pPr>
-              <w:rPr>
-                <w:rFonts w:ascii="Cambria" w:hAnsi="Cambria"/>
-                <w:sz w:val="20"/>
-                <w:szCs w:val="20"/>
-              </w:rPr>
-            </w:pPr>
-            <w:r>
-              <w:rPr>
-                <w:rFonts w:ascii="Cambria" w:hAnsi="Cambria"/>
-                <w:sz w:val="20"/>
-                <w:szCs w:val="20"/>
-              </w:rPr>
-              <w:t xml:space="preserve">  </w:t>
+              <w:t xml:space="preserve"> [108 </w:t>
             </w:r>
             <w:proofErr w:type="spellStart"/>
             <w:r>
@@ -7973,7 +7886,7 @@
                 <w:sz w:val="20"/>
                 <w:szCs w:val="20"/>
               </w:rPr>
-              <w:t>SmartPark.Core</w:t>
+              <w:t>ms</w:t>
             </w:r>
             <w:proofErr w:type="spellEnd"/>
             <w:r>
@@ -7982,7 +7895,58 @@
                 <w:sz w:val="20"/>
                 <w:szCs w:val="20"/>
               </w:rPr>
-              <w:t xml:space="preserve"> net10.0 succeeded (0.1s) → </w:t>
+              <w:t>]</w:t>
+            </w:r>
+          </w:p>
+          <w:p>
+            <w:pPr>
+              <w:rPr>
+                <w:rFonts w:ascii="Cambria" w:hAnsi="Cambria"/>
+                <w:sz w:val="20"/>
+                <w:szCs w:val="20"/>
+              </w:rPr>
+            </w:pPr>
+            <w:r>
+              <w:rPr>
+                <w:rFonts w:ascii="Cambria" w:hAnsi="Cambria"/>
+                <w:sz w:val="20"/>
+                <w:szCs w:val="20"/>
+              </w:rPr>
+              <w:t xml:space="preserve">  Ok, passed 100 tests.</w:t>
+            </w:r>
+          </w:p>
+          <w:p>
+            <w:pPr>
+              <w:rPr>
+                <w:rFonts w:ascii="Cambria" w:hAnsi="Cambria"/>
+                <w:sz w:val="20"/>
+                <w:szCs w:val="20"/>
+              </w:rPr>
+            </w:pPr>
+          </w:p>
+          <w:p>
+            <w:pPr>
+              <w:rPr>
+                <w:rFonts w:ascii="Cambria" w:hAnsi="Cambria"/>
+                <w:sz w:val="20"/>
+                <w:szCs w:val="20"/>
+              </w:rPr>
+            </w:pPr>
+            <w:r>
+              <w:rPr>
+                <w:rFonts w:ascii="Segoe UI Symbol" w:hAnsi="Segoe UI Symbol" w:cs="Segoe UI Symbol"/>
+                <w:sz w:val="20"/>
+                <w:szCs w:val="20"/>
+              </w:rPr>
+              <w:t>✓</w:t>
+            </w:r>
+            <w:r>
+              <w:rPr>
+                <w:rFonts w:ascii="Cambria" w:hAnsi="Cambria"/>
+                <w:sz w:val="20"/>
+                <w:szCs w:val="20"/>
+              </w:rPr>
+              <w:t xml:space="preserve"> </w:t>
             </w:r>
             <w:proofErr w:type="spellStart"/>
             <w:r>
@@ -7991,7 +7955,7 @@
                 <w:sz w:val="20"/>
                 <w:szCs w:val="20"/>
               </w:rPr>
-              <w:t>src</w:t>
+              <w:t>FeeIsNeverNegative</w:t>
             </w:r>
             <w:proofErr w:type="spellEnd"/>
             <w:r>
@@ -8000,7 +7964,7 @@
                 <w:sz w:val="20"/>
                 <w:szCs w:val="20"/>
               </w:rPr>
-              <w:t>\</w:t>
+              <w:t xml:space="preserve"> [39 </w:t>
             </w:r>
             <w:proofErr w:type="spellStart"/>
             <w:r>
@@ -8009,7 +7973,7 @@
                 <w:sz w:val="20"/>
                 <w:szCs w:val="20"/>
               </w:rPr>
-              <w:t>SmartPark.Core</w:t>
+              <w:t>ms</w:t>
             </w:r>
             <w:proofErr w:type="spellEnd"/>
             <w:r>
@@ -8018,24 +7982,58 @@
                 <w:sz w:val="20"/>
                 <w:szCs w:val="20"/>
               </w:rPr>
-              <w:t>\bin\Debug\net10.0\SmartPark.Core.dll</w:t>
-            </w:r>
-          </w:p>
-          <w:p>
-            <w:pPr>
-              <w:rPr>
-                <w:rFonts w:ascii="Cambria" w:hAnsi="Cambria"/>
-                <w:sz w:val="20"/>
-                <w:szCs w:val="20"/>
-              </w:rPr>
-            </w:pPr>
-            <w:r>
-              <w:rPr>
-                <w:rFonts w:ascii="Cambria" w:hAnsi="Cambria"/>
-                <w:sz w:val="20"/>
-                <w:szCs w:val="20"/>
-              </w:rPr>
-              <w:t xml:space="preserve">  </w:t>
+              <w:t>]</w:t>
+            </w:r>
+          </w:p>
+          <w:p>
+            <w:pPr>
+              <w:rPr>
+                <w:rFonts w:ascii="Cambria" w:hAnsi="Cambria"/>
+                <w:sz w:val="20"/>
+                <w:szCs w:val="20"/>
+              </w:rPr>
+            </w:pPr>
+            <w:r>
+              <w:rPr>
+                <w:rFonts w:ascii="Cambria" w:hAnsi="Cambria"/>
+                <w:sz w:val="20"/>
+                <w:szCs w:val="20"/>
+              </w:rPr>
+              <w:t xml:space="preserve">  Ok, passed 100 tests.</w:t>
+            </w:r>
+          </w:p>
+          <w:p>
+            <w:pPr>
+              <w:rPr>
+                <w:rFonts w:ascii="Cambria" w:hAnsi="Cambria"/>
+                <w:sz w:val="20"/>
+                <w:szCs w:val="20"/>
+              </w:rPr>
+            </w:pPr>
+          </w:p>
+          <w:p>
+            <w:pPr>
+              <w:rPr>
+                <w:rFonts w:ascii="Cambria" w:hAnsi="Cambria"/>
+                <w:sz w:val="20"/>
+                <w:szCs w:val="20"/>
+              </w:rPr>
+            </w:pPr>
+            <w:r>
+              <w:rPr>
+                <w:rFonts w:ascii="Segoe UI Symbol" w:hAnsi="Segoe UI Symbol" w:cs="Segoe UI Symbol"/>
+                <w:sz w:val="20"/>
+                <w:szCs w:val="20"/>
+              </w:rPr>
+              <w:t>✓</w:t>
+            </w:r>
+            <w:r>
+              <w:rPr>
+                <w:rFonts w:ascii="Cambria" w:hAnsi="Cambria"/>
+                <w:sz w:val="20"/>
+                <w:szCs w:val="20"/>
+              </w:rPr>
+              <w:t xml:space="preserve"> LostTicketAddsExactly20000 [20 </w:t>
             </w:r>
             <w:proofErr w:type="spellStart"/>
             <w:r>
@@ -8044,7 +8042,7 @@
                 <w:sz w:val="20"/>
                 <w:szCs w:val="20"/>
               </w:rPr>
-              <w:t>SmartPark.Tests</w:t>
+              <w:t>ms</w:t>
             </w:r>
             <w:proofErr w:type="spellEnd"/>
             <w:r>
@@ -8053,7 +8051,58 @@
                 <w:sz w:val="20"/>
                 <w:szCs w:val="20"/>
               </w:rPr>
-              <w:t xml:space="preserve"> net10.0 succeeded (0.2s) → tests\</w:t>
+              <w:t>]</w:t>
+            </w:r>
+          </w:p>
+          <w:p>
+            <w:pPr>
+              <w:rPr>
+                <w:rFonts w:ascii="Cambria" w:hAnsi="Cambria"/>
+                <w:sz w:val="20"/>
+                <w:szCs w:val="20"/>
+              </w:rPr>
+            </w:pPr>
+            <w:r>
+              <w:rPr>
+                <w:rFonts w:ascii="Cambria" w:hAnsi="Cambria"/>
+                <w:sz w:val="20"/>
+                <w:szCs w:val="20"/>
+              </w:rPr>
+              <w:t xml:space="preserve">  Ok, passed 100 tests.</w:t>
+            </w:r>
+          </w:p>
+          <w:p>
+            <w:pPr>
+              <w:rPr>
+                <w:rFonts w:ascii="Cambria" w:hAnsi="Cambria"/>
+                <w:sz w:val="20"/>
+                <w:szCs w:val="20"/>
+              </w:rPr>
+            </w:pPr>
+          </w:p>
+          <w:p>
+            <w:pPr>
+              <w:rPr>
+                <w:rFonts w:ascii="Cambria" w:hAnsi="Cambria"/>
+                <w:sz w:val="20"/>
+                <w:szCs w:val="20"/>
+              </w:rPr>
+            </w:pPr>
+            <w:r>
+              <w:rPr>
+                <w:rFonts w:ascii="Segoe UI Symbol" w:hAnsi="Segoe UI Symbol" w:cs="Segoe UI Symbol"/>
+                <w:sz w:val="20"/>
+                <w:szCs w:val="20"/>
+              </w:rPr>
+              <w:t>✓</w:t>
+            </w:r>
+            <w:r>
+              <w:rPr>
+                <w:rFonts w:ascii="Cambria" w:hAnsi="Cambria"/>
+                <w:sz w:val="20"/>
+                <w:szCs w:val="20"/>
+              </w:rPr>
+              <w:t xml:space="preserve"> </w:t>
             </w:r>
             <w:proofErr w:type="spellStart"/>
             <w:r>
@@ -8062,7 +8111,7 @@
                 <w:sz w:val="20"/>
                 <w:szCs w:val="20"/>
               </w:rPr>
-              <w:t>SmartPark.Tests</w:t>
+              <w:t>MembersPayLessThanOrEqualToGuests</w:t>
             </w:r>
             <w:proofErr w:type="spellEnd"/>
             <w:r>
@@ -8071,24 +8120,7 @@
                 <w:sz w:val="20"/>
                 <w:szCs w:val="20"/>
               </w:rPr>
-              <w:t>\bin\Debug\net10.0\SmartPark.Tests.dll</w:t>
-            </w:r>
-          </w:p>
-          <w:p>
-            <w:pPr>
-              <w:rPr>
-                <w:rFonts w:ascii="Cambria" w:hAnsi="Cambria"/>
-                <w:sz w:val="20"/>
-                <w:szCs w:val="20"/>
-              </w:rPr>
-            </w:pPr>
-            <w:r>
-              <w:rPr>
-                <w:rFonts w:ascii="Cambria" w:hAnsi="Cambria"/>
-                <w:sz w:val="20"/>
-                <w:szCs w:val="20"/>
-              </w:rPr>
-              <w:t xml:space="preserve">[xUnit.net 00:00:00.00] xUnit.net </w:t>
+              <w:t xml:space="preserve"> [21 </w:t>
             </w:r>
             <w:proofErr w:type="spellStart"/>
             <w:r>
@@ -8097,7 +8129,7 @@
                 <w:sz w:val="20"/>
                 <w:szCs w:val="20"/>
               </w:rPr>
-              <w:t>VSTest</w:t>
+              <w:t>ms</w:t>
             </w:r>
             <w:proofErr w:type="spellEnd"/>
             <w:r>
@@ -8106,24 +8138,58 @@
                 <w:sz w:val="20"/>
                 <w:szCs w:val="20"/>
               </w:rPr>
-              <w:t xml:space="preserve"> Adapter v3.1.4+50e68bbb8b (64-bit .NET 10.0.0)</w:t>
-            </w:r>
-          </w:p>
-          <w:p>
-            <w:pPr>
-              <w:rPr>
-                <w:rFonts w:ascii="Cambria" w:hAnsi="Cambria"/>
-                <w:sz w:val="20"/>
-                <w:szCs w:val="20"/>
-              </w:rPr>
-            </w:pPr>
-            <w:r>
-              <w:rPr>
-                <w:rFonts w:ascii="Cambria" w:hAnsi="Cambria"/>
-                <w:sz w:val="20"/>
-                <w:szCs w:val="20"/>
-              </w:rPr>
-              <w:t xml:space="preserve">[xUnit.net 00:00:00.11]   Discovering: </w:t>
+              <w:t>]</w:t>
+            </w:r>
+          </w:p>
+          <w:p>
+            <w:pPr>
+              <w:rPr>
+                <w:rFonts w:ascii="Cambria" w:hAnsi="Cambria"/>
+                <w:sz w:val="20"/>
+                <w:szCs w:val="20"/>
+              </w:rPr>
+            </w:pPr>
+            <w:r>
+              <w:rPr>
+                <w:rFonts w:ascii="Cambria" w:hAnsi="Cambria"/>
+                <w:sz w:val="20"/>
+                <w:szCs w:val="20"/>
+              </w:rPr>
+              <w:t xml:space="preserve">  Ok, passed 100 tests.</w:t>
+            </w:r>
+          </w:p>
+          <w:p>
+            <w:pPr>
+              <w:rPr>
+                <w:rFonts w:ascii="Cambria" w:hAnsi="Cambria"/>
+                <w:sz w:val="20"/>
+                <w:szCs w:val="20"/>
+              </w:rPr>
+            </w:pPr>
+          </w:p>
+          <w:p>
+            <w:pPr>
+              <w:rPr>
+                <w:rFonts w:ascii="Cambria" w:hAnsi="Cambria"/>
+                <w:sz w:val="20"/>
+                <w:szCs w:val="20"/>
+              </w:rPr>
+            </w:pPr>
+            <w:r>
+              <w:rPr>
+                <w:rFonts w:ascii="Segoe UI Symbol" w:hAnsi="Segoe UI Symbol" w:cs="Segoe UI Symbol"/>
+                <w:sz w:val="20"/>
+                <w:szCs w:val="20"/>
+              </w:rPr>
+              <w:t>✓</w:t>
+            </w:r>
+            <w:r>
+              <w:rPr>
+                <w:rFonts w:ascii="Cambria" w:hAnsi="Cambria"/>
+                <w:sz w:val="20"/>
+                <w:szCs w:val="20"/>
+              </w:rPr>
+              <w:t xml:space="preserve"> </w:t>
             </w:r>
             <w:proofErr w:type="spellStart"/>
             <w:r>
@@ -8132,34 +8198,16 @@
                 <w:sz w:val="20"/>
                 <w:szCs w:val="20"/>
               </w:rPr>
-              <w:t>SmartPark.Tests</w:t>
+              <w:t>LongerStaysCostMoreOrEqual</w:t>
             </w:r>
             <w:proofErr w:type="spellEnd"/>
-          </w:p>
-          <w:p>
-            <w:pPr>
-              <w:rPr>
-                <w:rFonts w:ascii="Cambria" w:hAnsi="Cambria"/>
-                <w:sz w:val="20"/>
-                <w:szCs w:val="20"/>
-              </w:rPr>
-            </w:pPr>
-            <w:r>
-              <w:rPr>
-                <w:rFonts w:ascii="Cambria" w:hAnsi="Cambria"/>
-                <w:sz w:val="20"/>
-                <w:szCs w:val="20"/>
-              </w:rPr>
-              <w:t>[xUnit.net 00:00:00.17]   Discovered</w:t>
-            </w:r>
-            <w:proofErr w:type="gramStart"/>
-            <w:r>
-              <w:rPr>
-                <w:rFonts w:ascii="Cambria" w:hAnsi="Cambria"/>
-                <w:sz w:val="20"/>
-                <w:szCs w:val="20"/>
-              </w:rPr>
-              <w:t xml:space="preserve">:  </w:t>
+            <w:r>
+              <w:rPr>
+                <w:rFonts w:ascii="Cambria" w:hAnsi="Cambria"/>
+                <w:sz w:val="20"/>
+                <w:szCs w:val="20"/>
+              </w:rPr>
+              <w:t xml:space="preserve"> [118 </w:t>
             </w:r>
             <w:proofErr w:type="spellStart"/>
             <w:r>
@@ -8168,149 +8216,33 @@
                 <w:sz w:val="20"/>
                 <w:szCs w:val="20"/>
               </w:rPr>
-              <w:t>SmartPark</w:t>
-            </w:r>
-            <w:proofErr w:type="gramEnd"/>
-            <w:r>
-              <w:rPr>
-                <w:rFonts w:ascii="Cambria" w:hAnsi="Cambria"/>
-                <w:sz w:val="20"/>
-                <w:szCs w:val="20"/>
-              </w:rPr>
-              <w:t>.Tests</w:t>
+              <w:t>ms</w:t>
             </w:r>
             <w:proofErr w:type="spellEnd"/>
-          </w:p>
-          <w:p>
-            <w:pPr>
-              <w:rPr>
-                <w:rFonts w:ascii="Cambria" w:hAnsi="Cambria"/>
-                <w:sz w:val="20"/>
-                <w:szCs w:val="20"/>
-              </w:rPr>
-            </w:pPr>
-            <w:r>
-              <w:rPr>
-                <w:rFonts w:ascii="Cambria" w:hAnsi="Cambria"/>
-                <w:sz w:val="20"/>
-                <w:szCs w:val="20"/>
-              </w:rPr>
-              <w:t xml:space="preserve">[xUnit.net 00:00:00.21]   Starting:    </w:t>
-            </w:r>
-            <w:proofErr w:type="spellStart"/>
-            <w:r>
-              <w:rPr>
-                <w:rFonts w:ascii="Cambria" w:hAnsi="Cambria"/>
-                <w:sz w:val="20"/>
-                <w:szCs w:val="20"/>
-              </w:rPr>
-              <w:t>SmartPark.Tests</w:t>
-            </w:r>
-            <w:proofErr w:type="spellEnd"/>
-          </w:p>
-          <w:p>
-            <w:pPr>
-              <w:rPr>
-                <w:rFonts w:ascii="Cambria" w:hAnsi="Cambria"/>
-                <w:sz w:val="20"/>
-                <w:szCs w:val="20"/>
-              </w:rPr>
-            </w:pPr>
-            <w:r>
-              <w:rPr>
-                <w:rFonts w:ascii="Cambria" w:hAnsi="Cambria"/>
-                <w:sz w:val="20"/>
-                <w:szCs w:val="20"/>
-              </w:rPr>
-              <w:t xml:space="preserve">[xUnit.net 00:00:00.31]   Finished:    </w:t>
-            </w:r>
-            <w:proofErr w:type="spellStart"/>
-            <w:r>
-              <w:rPr>
-                <w:rFonts w:ascii="Cambria" w:hAnsi="Cambria"/>
-                <w:sz w:val="20"/>
-                <w:szCs w:val="20"/>
-              </w:rPr>
-              <w:t>SmartPark.Tests</w:t>
-            </w:r>
-            <w:proofErr w:type="spellEnd"/>
-          </w:p>
-          <w:p>
-            <w:pPr>
-              <w:rPr>
-                <w:rFonts w:ascii="Cambria" w:hAnsi="Cambria"/>
-                <w:sz w:val="20"/>
-                <w:szCs w:val="20"/>
-              </w:rPr>
-            </w:pPr>
-            <w:r>
-              <w:rPr>
-                <w:rFonts w:ascii="Cambria" w:hAnsi="Cambria"/>
-                <w:sz w:val="20"/>
-                <w:szCs w:val="20"/>
-              </w:rPr>
-              <w:t xml:space="preserve">  </w:t>
-            </w:r>
-            <w:proofErr w:type="spellStart"/>
-            <w:r>
-              <w:rPr>
-                <w:rFonts w:ascii="Cambria" w:hAnsi="Cambria"/>
-                <w:sz w:val="20"/>
-                <w:szCs w:val="20"/>
-              </w:rPr>
-              <w:t>SmartPark.Tests</w:t>
-            </w:r>
-            <w:proofErr w:type="spellEnd"/>
-            <w:r>
-              <w:rPr>
-                <w:rFonts w:ascii="Cambria" w:hAnsi="Cambria"/>
-                <w:sz w:val="20"/>
-                <w:szCs w:val="20"/>
-              </w:rPr>
-              <w:t xml:space="preserve"> test net10.0 succeeded (1.3s)</w:t>
-            </w:r>
-          </w:p>
-          <w:p>
-            <w:pPr>
-              <w:rPr>
-                <w:rFonts w:ascii="Cambria" w:hAnsi="Cambria"/>
-                <w:sz w:val="20"/>
-                <w:szCs w:val="20"/>
-              </w:rPr>
-            </w:pPr>
-          </w:p>
-          <w:p>
-            <w:pPr>
-              <w:rPr>
-                <w:rFonts w:ascii="Cambria" w:hAnsi="Cambria"/>
-                <w:sz w:val="20"/>
-                <w:szCs w:val="20"/>
-              </w:rPr>
-            </w:pPr>
-            <w:r>
-              <w:rPr>
-                <w:rFonts w:ascii="Cambria" w:hAnsi="Cambria"/>
-                <w:sz w:val="20"/>
-                <w:szCs w:val="20"/>
-              </w:rPr>
-              <w:t>Test summary: total: 12, failed: 0, succeeded: 12, skipped: 0, duration: 1.3s</w:t>
-            </w:r>
-          </w:p>
-          <w:p>
-            <w:pPr>
-              <w:rPr>
-                <w:rFonts w:ascii="Cambria" w:hAnsi="Cambria"/>
-                <w:sz w:val="20"/>
-                <w:szCs w:val="20"/>
-              </w:rPr>
-            </w:pPr>
-            <w:r>
-              <w:rPr>
-                <w:rFonts w:ascii="Cambria" w:hAnsi="Cambria"/>
-                <w:sz w:val="20"/>
-                <w:szCs w:val="20"/>
-              </w:rPr>
-              <w:t>Build succeeded in 2.7s</w:t>
+            <w:r>
+              <w:rPr>
+                <w:rFonts w:ascii="Cambria" w:hAnsi="Cambria"/>
+                <w:sz w:val="20"/>
+                <w:szCs w:val="20"/>
+              </w:rPr>
+              <w:t>]</w:t>
+            </w:r>
+          </w:p>
+          <w:p>
+            <w:pPr>
+              <w:rPr>
+                <w:rFonts w:ascii="Cambria" w:hAnsi="Cambria"/>
+                <w:sz w:val="20"/>
+                <w:szCs w:val="20"/>
+              </w:rPr>
+            </w:pPr>
+            <w:r>
+              <w:rPr>
+                <w:rFonts w:ascii="Cambria" w:hAnsi="Cambria"/>
+                <w:sz w:val="20"/>
+                <w:szCs w:val="20"/>
+              </w:rPr>
+              <w:t xml:space="preserve">  Ok, passed 100 tests.</w:t>
             </w:r>
           </w:p>
         </w:tc>
@@ -8450,7 +8382,7 @@
                 <w:rFonts w:ascii="Cambria" w:hAnsi="Cambria"/>
                 <w:szCs w:val="22"/>
               </w:rPr>
-              <w:t>Restore complete (0.9s)</w:t>
+              <w:t>Restore complete (1.0s)</w:t>
             </w:r>
           </w:p>
           <w:p>
@@ -8481,21 +8413,23 @@
                 <w:rFonts w:ascii="Cambria" w:hAnsi="Cambria"/>
                 <w:szCs w:val="22"/>
               </w:rPr>
-              <w:t xml:space="preserve"> net10.0 succeeded (0.1s) </w:t>
-            </w:r>
-            <w:r>
-              <w:rPr>
-                <w:rFonts w:ascii="Cambria" w:hAnsi="Cambria" w:cs="Times New Roman"/>
+              <w:t xml:space="preserve"> net10.0 succeeded (0.2s) → </w:t>
+            </w:r>
+            <w:proofErr w:type="spellStart"/>
+            <w:r>
+              <w:rPr>
+                <w:rFonts w:ascii="Cambria" w:hAnsi="Cambria"/>
                 <w:szCs w:val="22"/>
               </w:rPr>
-              <w:t>→</w:t>
-            </w:r>
+              <w:t>src</w:t>
+            </w:r>
+            <w:proofErr w:type="spellEnd"/>
             <w:r>
               <w:rPr>
                 <w:rFonts w:ascii="Cambria" w:hAnsi="Cambria"/>
                 <w:szCs w:val="22"/>
               </w:rPr>
-              <w:t xml:space="preserve"> </w:t>
+              <w:t>\</w:t>
             </w:r>
             <w:proofErr w:type="spellStart"/>
             <w:r>
@@ -8503,7 +8437,7 @@
                 <w:rFonts w:ascii="Cambria" w:hAnsi="Cambria"/>
                 <w:szCs w:val="22"/>
               </w:rPr>
-              <w:t>src</w:t>
+              <w:t>SmartPark.Core</w:t>
             </w:r>
             <w:proofErr w:type="spellEnd"/>
             <w:r>
@@ -8511,7 +8445,22 @@
                 <w:rFonts w:ascii="Cambria" w:hAnsi="Cambria"/>
                 <w:szCs w:val="22"/>
               </w:rPr>
-              <w:t>\</w:t>
+              <w:t>\bin\Debug\net10.0\SmartPark.Core.dll</w:t>
+            </w:r>
+          </w:p>
+          <w:p>
+            <w:pPr>
+              <w:rPr>
+                <w:rFonts w:ascii="Cambria" w:hAnsi="Cambria"/>
+                <w:szCs w:val="22"/>
+              </w:rPr>
+            </w:pPr>
+            <w:r>
+              <w:rPr>
+                <w:rFonts w:ascii="Cambria" w:hAnsi="Cambria"/>
+                <w:szCs w:val="22"/>
+              </w:rPr>
+              <w:t xml:space="preserve">  </w:t>
             </w:r>
             <w:proofErr w:type="spellStart"/>
             <w:r>
@@ -8519,7 +8468,7 @@
                 <w:rFonts w:ascii="Cambria" w:hAnsi="Cambria"/>
                 <w:szCs w:val="22"/>
               </w:rPr>
-              <w:t>SmartPark.Core</w:t>
+              <w:t>SmartPark.Tests</w:t>
             </w:r>
             <w:proofErr w:type="spellEnd"/>
             <w:r>
@@ -8527,21 +8476,181 @@
                 <w:rFonts w:ascii="Cambria" w:hAnsi="Cambria"/>
                 <w:szCs w:val="22"/>
               </w:rPr>
-              <w:t>\bin\Debug\net10.0\SmartPark.Core.dll</w:t>
-            </w:r>
-          </w:p>
-          <w:p>
-            <w:pPr>
+              <w:t xml:space="preserve"> net10.0 succeeded (0.2s) → tests\</w:t>
+            </w:r>
+            <w:proofErr w:type="spellStart"/>
+            <w:r>
               <w:rPr>
                 <w:rFonts w:ascii="Cambria" w:hAnsi="Cambria"/>
                 <w:szCs w:val="22"/>
               </w:rPr>
-            </w:pPr>
+              <w:t>SmartPark.Tests</w:t>
+            </w:r>
+            <w:proofErr w:type="spellEnd"/>
             <w:r>
               <w:rPr>
                 <w:rFonts w:ascii="Cambria" w:hAnsi="Cambria"/>
                 <w:szCs w:val="22"/>
               </w:rPr>
+              <w:t>\bin\Debug\net10.0\SmartPark.Tests.dll</w:t>
+            </w:r>
+          </w:p>
+          <w:p>
+            <w:pPr>
+              <w:rPr>
+                <w:rFonts w:ascii="Cambria" w:hAnsi="Cambria"/>
+                <w:szCs w:val="22"/>
+              </w:rPr>
+            </w:pPr>
+            <w:r>
+              <w:rPr>
+                <w:rFonts w:ascii="Cambria" w:hAnsi="Cambria"/>
+                <w:szCs w:val="22"/>
+              </w:rPr>
+              <w:t xml:space="preserve">[xUnit.net 00:00:00.00] xUnit.net </w:t>
+            </w:r>
+            <w:proofErr w:type="spellStart"/>
+            <w:r>
+              <w:rPr>
+                <w:rFonts w:ascii="Cambria" w:hAnsi="Cambria"/>
+                <w:szCs w:val="22"/>
+              </w:rPr>
+              <w:t>VSTest</w:t>
+            </w:r>
+            <w:proofErr w:type="spellEnd"/>
+            <w:r>
+              <w:rPr>
+                <w:rFonts w:ascii="Cambria" w:hAnsi="Cambria"/>
+                <w:szCs w:val="22"/>
+              </w:rPr>
+              <w:t xml:space="preserve"> Adapter v3.1.4+50e68bbb8b (64-bit .NET 10.0.0)</w:t>
+            </w:r>
+          </w:p>
+          <w:p>
+            <w:pPr>
+              <w:rPr>
+                <w:rFonts w:ascii="Cambria" w:hAnsi="Cambria"/>
+                <w:szCs w:val="22"/>
+              </w:rPr>
+            </w:pPr>
+            <w:r>
+              <w:rPr>
+                <w:rFonts w:ascii="Cambria" w:hAnsi="Cambria"/>
+                <w:szCs w:val="22"/>
+              </w:rPr>
+              <w:t xml:space="preserve">[xUnit.net 00:00:00.13]   Discovering: </w:t>
+            </w:r>
+            <w:proofErr w:type="spellStart"/>
+            <w:r>
+              <w:rPr>
+                <w:rFonts w:ascii="Cambria" w:hAnsi="Cambria"/>
+                <w:szCs w:val="22"/>
+              </w:rPr>
+              <w:t>SmartPark.Tests</w:t>
+            </w:r>
+            <w:proofErr w:type="spellEnd"/>
+          </w:p>
+          <w:p>
+            <w:pPr>
+              <w:rPr>
+                <w:rFonts w:ascii="Cambria" w:hAnsi="Cambria"/>
+                <w:szCs w:val="22"/>
+              </w:rPr>
+            </w:pPr>
+            <w:r>
+              <w:rPr>
+                <w:rFonts w:ascii="Cambria" w:hAnsi="Cambria"/>
+                <w:szCs w:val="22"/>
+              </w:rPr>
+              <w:t>[xUnit.net 00:00:00.20]   Discovered</w:t>
+            </w:r>
+            <w:proofErr w:type="gramStart"/>
+            <w:r>
+              <w:rPr>
+                <w:rFonts w:ascii="Cambria" w:hAnsi="Cambria"/>
+                <w:szCs w:val="22"/>
+              </w:rPr>
+              <w:t xml:space="preserve">:  </w:t>
+            </w:r>
+            <w:proofErr w:type="spellStart"/>
+            <w:r>
+              <w:rPr>
+                <w:rFonts w:ascii="Cambria" w:hAnsi="Cambria"/>
+                <w:szCs w:val="22"/>
+              </w:rPr>
+              <w:t>SmartPark</w:t>
+            </w:r>
+            <w:proofErr w:type="gramEnd"/>
+            <w:r>
+              <w:rPr>
+                <w:rFonts w:ascii="Cambria" w:hAnsi="Cambria"/>
+                <w:szCs w:val="22"/>
+              </w:rPr>
+              <w:t>.Tests</w:t>
+            </w:r>
+            <w:proofErr w:type="spellEnd"/>
+          </w:p>
+          <w:p>
+            <w:pPr>
+              <w:rPr>
+                <w:rFonts w:ascii="Cambria" w:hAnsi="Cambria"/>
+                <w:szCs w:val="22"/>
+              </w:rPr>
+            </w:pPr>
+            <w:r>
+              <w:rPr>
+                <w:rFonts w:ascii="Cambria" w:hAnsi="Cambria"/>
+                <w:szCs w:val="22"/>
+              </w:rPr>
+              <w:t xml:space="preserve">[xUnit.net 00:00:00.23]   Starting:    </w:t>
+            </w:r>
+            <w:proofErr w:type="spellStart"/>
+            <w:r>
+              <w:rPr>
+                <w:rFonts w:ascii="Cambria" w:hAnsi="Cambria"/>
+                <w:szCs w:val="22"/>
+              </w:rPr>
+              <w:t>SmartPark.Tests</w:t>
+            </w:r>
+            <w:proofErr w:type="spellEnd"/>
+          </w:p>
+          <w:p>
+            <w:pPr>
+              <w:rPr>
+                <w:rFonts w:ascii="Cambria" w:hAnsi="Cambria"/>
+                <w:szCs w:val="22"/>
+              </w:rPr>
+            </w:pPr>
+            <w:r>
+              <w:rPr>
+                <w:rFonts w:ascii="Cambria" w:hAnsi="Cambria"/>
+                <w:szCs w:val="22"/>
+              </w:rPr>
+              <w:lastRenderedPageBreak/>
+              <w:t xml:space="preserve">[xUnit.net 00:00:00.40]   Finished:    </w:t>
+            </w:r>
+            <w:proofErr w:type="spellStart"/>
+            <w:r>
+              <w:rPr>
+                <w:rFonts w:ascii="Cambria" w:hAnsi="Cambria"/>
+                <w:szCs w:val="22"/>
+              </w:rPr>
+              <w:t>SmartPark.Tests</w:t>
+            </w:r>
+            <w:proofErr w:type="spellEnd"/>
+          </w:p>
+          <w:p>
+            <w:pPr>
+              <w:rPr>
+                <w:rFonts w:ascii="Cambria" w:hAnsi="Cambria"/>
+                <w:szCs w:val="22"/>
+              </w:rPr>
+            </w:pPr>
+            <w:r>
+              <w:rPr>
+                <w:rFonts w:ascii="Cambria" w:hAnsi="Cambria"/>
+                <w:szCs w:val="22"/>
+              </w:rPr>
               <w:t xml:space="preserve">  </w:t>
             </w:r>
             <w:proofErr w:type="spellStart"/>
@@ -8558,250 +8667,45 @@
                 <w:rFonts w:ascii="Cambria" w:hAnsi="Cambria"/>
                 <w:szCs w:val="22"/>
               </w:rPr>
-              <w:t xml:space="preserve"> net10.0 succeeded (0.1s) </w:t>
-            </w:r>
-            <w:r>
-              <w:rPr>
-                <w:rFonts w:ascii="Cambria" w:hAnsi="Cambria" w:cs="Times New Roman"/>
+              <w:t xml:space="preserve"> test net10.0 succeeded (1.5s)</w:t>
+            </w:r>
+          </w:p>
+          <w:p>
+            <w:pPr>
+              <w:rPr>
+                <w:rFonts w:ascii="Cambria" w:hAnsi="Cambria"/>
                 <w:szCs w:val="22"/>
               </w:rPr>
-              <w:t>→</w:t>
-            </w:r>
-            <w:r>
+            </w:pPr>
+          </w:p>
+          <w:p>
+            <w:pPr>
               <w:rPr>
                 <w:rFonts w:ascii="Cambria" w:hAnsi="Cambria"/>
                 <w:szCs w:val="22"/>
               </w:rPr>
-              <w:t xml:space="preserve"> tests\</w:t>
-            </w:r>
-            <w:proofErr w:type="spellStart"/>
+            </w:pPr>
             <w:r>
               <w:rPr>
                 <w:rFonts w:ascii="Cambria" w:hAnsi="Cambria"/>
                 <w:szCs w:val="22"/>
               </w:rPr>
-              <w:t>SmartPark.Tests</w:t>
-            </w:r>
-            <w:proofErr w:type="spellEnd"/>
-            <w:r>
+              <w:t>Test summary: total: 5, failed: 0, succeeded: 5, skipped: 0, duration: 1.5s</w:t>
+            </w:r>
+          </w:p>
+          <w:p>
+            <w:pPr>
               <w:rPr>
                 <w:rFonts w:ascii="Cambria" w:hAnsi="Cambria"/>
                 <w:szCs w:val="22"/>
               </w:rPr>
-              <w:t>\bin\Debug\net10.0\SmartPark.Tests.dll</w:t>
-            </w:r>
-          </w:p>
-          <w:p>
-            <w:pPr>
+            </w:pPr>
+            <w:r>
               <w:rPr>
                 <w:rFonts w:ascii="Cambria" w:hAnsi="Cambria"/>
                 <w:szCs w:val="22"/>
               </w:rPr>
-            </w:pPr>
-            <w:r>
-              <w:rPr>
-                <w:rFonts w:ascii="Cambria" w:hAnsi="Cambria"/>
-                <w:szCs w:val="22"/>
-              </w:rPr>
-              <w:t xml:space="preserve">[xUnit.net 00:00:00.00] xUnit.net </w:t>
-            </w:r>
-            <w:proofErr w:type="spellStart"/>
-            <w:r>
-              <w:rPr>
-                <w:rFonts w:ascii="Cambria" w:hAnsi="Cambria"/>
-                <w:szCs w:val="22"/>
-              </w:rPr>
-              <w:t>VSTest</w:t>
-            </w:r>
-            <w:proofErr w:type="spellEnd"/>
-            <w:r>
-              <w:rPr>
-                <w:rFonts w:ascii="Cambria" w:hAnsi="Cambria"/>
-                <w:szCs w:val="22"/>
-              </w:rPr>
-              <w:t xml:space="preserve"> Adapter v3.1.4+50e68bbb8b (64-bit .NET 10.0.0)</w:t>
-            </w:r>
-          </w:p>
-          <w:p>
-            <w:pPr>
-              <w:rPr>
-                <w:rFonts w:ascii="Cambria" w:hAnsi="Cambria"/>
-                <w:szCs w:val="22"/>
-              </w:rPr>
-            </w:pPr>
-            <w:r>
-              <w:rPr>
-                <w:rFonts w:ascii="Cambria" w:hAnsi="Cambria"/>
-                <w:szCs w:val="22"/>
-              </w:rPr>
-              <w:t xml:space="preserve">[xUnit.net 00:00:00.10]   Discovering: </w:t>
-            </w:r>
-            <w:proofErr w:type="spellStart"/>
-            <w:r>
-              <w:rPr>
-                <w:rFonts w:ascii="Cambria" w:hAnsi="Cambria"/>
-                <w:szCs w:val="22"/>
-              </w:rPr>
-              <w:t>SmartPark.Tests</w:t>
-            </w:r>
-            <w:proofErr w:type="spellEnd"/>
-          </w:p>
-          <w:p>
-            <w:pPr>
-              <w:rPr>
-                <w:rFonts w:ascii="Cambria" w:hAnsi="Cambria"/>
-                <w:szCs w:val="22"/>
-              </w:rPr>
-            </w:pPr>
-            <w:r>
-              <w:rPr>
-                <w:rFonts w:ascii="Cambria" w:hAnsi="Cambria"/>
-                <w:szCs w:val="22"/>
-              </w:rPr>
-              <w:t>[xUnit.net 00:00:00.17]   Discovered</w:t>
-            </w:r>
-            <w:proofErr w:type="gramStart"/>
-            <w:r>
-              <w:rPr>
-                <w:rFonts w:ascii="Cambria" w:hAnsi="Cambria"/>
-                <w:szCs w:val="22"/>
-              </w:rPr>
-              <w:t xml:space="preserve">:  </w:t>
-            </w:r>
-            <w:proofErr w:type="spellStart"/>
-            <w:r>
-              <w:rPr>
-                <w:rFonts w:ascii="Cambria" w:hAnsi="Cambria"/>
-                <w:szCs w:val="22"/>
-              </w:rPr>
-              <w:t>SmartPark</w:t>
-            </w:r>
-            <w:proofErr w:type="gramEnd"/>
-            <w:r>
-              <w:rPr>
-                <w:rFonts w:ascii="Cambria" w:hAnsi="Cambria"/>
-                <w:szCs w:val="22"/>
-              </w:rPr>
-              <w:t>.Tests</w:t>
-            </w:r>
-            <w:proofErr w:type="spellEnd"/>
-          </w:p>
-          <w:p>
-            <w:pPr>
-              <w:rPr>
-                <w:rFonts w:ascii="Cambria" w:hAnsi="Cambria"/>
-                <w:szCs w:val="22"/>
-              </w:rPr>
-            </w:pPr>
-            <w:r>
-              <w:rPr>
-                <w:rFonts w:ascii="Cambria" w:hAnsi="Cambria"/>
-                <w:szCs w:val="22"/>
-              </w:rPr>
-              <w:t xml:space="preserve">[xUnit.net 00:00:00.20]   Starting:    </w:t>
-            </w:r>
-            <w:proofErr w:type="spellStart"/>
-            <w:r>
-              <w:rPr>
-                <w:rFonts w:ascii="Cambria" w:hAnsi="Cambria"/>
-                <w:szCs w:val="22"/>
-              </w:rPr>
-              <w:t>SmartPark.Tests</w:t>
-            </w:r>
-            <w:proofErr w:type="spellEnd"/>
-          </w:p>
-          <w:p>
-            <w:pPr>
-              <w:rPr>
-                <w:rFonts w:ascii="Cambria" w:hAnsi="Cambria"/>
-                <w:szCs w:val="22"/>
-              </w:rPr>
-            </w:pPr>
-            <w:r>
-              <w:rPr>
-                <w:rFonts w:ascii="Cambria" w:hAnsi="Cambria"/>
-                <w:szCs w:val="22"/>
-              </w:rPr>
-              <w:lastRenderedPageBreak/>
-              <w:t xml:space="preserve">[xUnit.net 00:00:00.36]   Finished:    </w:t>
-            </w:r>
-            <w:proofErr w:type="spellStart"/>
-            <w:r>
-              <w:rPr>
-                <w:rFonts w:ascii="Cambria" w:hAnsi="Cambria"/>
-                <w:szCs w:val="22"/>
-              </w:rPr>
-              <w:t>SmartPark.Tests</w:t>
-            </w:r>
-            <w:proofErr w:type="spellEnd"/>
-          </w:p>
-          <w:p>
-            <w:pPr>
-              <w:rPr>
-                <w:rFonts w:ascii="Cambria" w:hAnsi="Cambria"/>
-                <w:szCs w:val="22"/>
-              </w:rPr>
-            </w:pPr>
-            <w:r>
-              <w:rPr>
-                <w:rFonts w:ascii="Cambria" w:hAnsi="Cambria"/>
-                <w:szCs w:val="22"/>
-              </w:rPr>
-              <w:t xml:space="preserve">  </w:t>
-            </w:r>
-            <w:proofErr w:type="spellStart"/>
-            <w:r>
-              <w:rPr>
-                <w:rFonts w:ascii="Cambria" w:hAnsi="Cambria"/>
-                <w:szCs w:val="22"/>
-              </w:rPr>
-              <w:t>SmartPark.Tests</w:t>
-            </w:r>
-            <w:proofErr w:type="spellEnd"/>
-            <w:r>
-              <w:rPr>
-                <w:rFonts w:ascii="Cambria" w:hAnsi="Cambria"/>
-                <w:szCs w:val="22"/>
-              </w:rPr>
-              <w:t xml:space="preserve"> test net10.0 succeeded (1.4s)</w:t>
-            </w:r>
-          </w:p>
-          <w:p>
-            <w:pPr>
-              <w:rPr>
-                <w:rFonts w:ascii="Cambria" w:hAnsi="Cambria"/>
-                <w:szCs w:val="22"/>
-              </w:rPr>
-            </w:pPr>
-          </w:p>
-          <w:p>
-            <w:pPr>
-              <w:rPr>
-                <w:rFonts w:ascii="Cambria" w:hAnsi="Cambria"/>
-                <w:szCs w:val="22"/>
-              </w:rPr>
-            </w:pPr>
-            <w:r>
-              <w:rPr>
-                <w:rFonts w:ascii="Cambria" w:hAnsi="Cambria"/>
-                <w:szCs w:val="22"/>
-              </w:rPr>
-              <w:t>Test summary: total: 1, failed: 0, succeeded: 1, skipped: 0, duration: 1.3s</w:t>
-            </w:r>
-          </w:p>
-          <w:p>
-            <w:pPr>
-              <w:rPr>
-                <w:rFonts w:ascii="Cambria" w:hAnsi="Cambria"/>
-                <w:szCs w:val="22"/>
-              </w:rPr>
-            </w:pPr>
-            <w:r>
-              <w:rPr>
-                <w:rFonts w:ascii="Cambria" w:hAnsi="Cambria"/>
-                <w:szCs w:val="22"/>
-              </w:rPr>
-              <w:t>Build succeeded in 2.8s</w:t>
+              <w:t>Build succeeded in 3.0s</w:t>
             </w:r>
           </w:p>
         </w:tc>
@@ -9048,7 +8952,7 @@
                 <w:rFonts w:ascii="Cambria" w:hAnsi="Cambria"/>
                 <w:szCs w:val="22"/>
               </w:rPr>
-              <w:t>76.9%</w:t>
+              <w:t>77.6%</w:t>
             </w:r>
           </w:p>
         </w:tc>
@@ -9070,7 +8974,7 @@
                 <w:rFonts w:ascii="Cambria" w:hAnsi="Cambria"/>
                 <w:szCs w:val="22"/>
               </w:rPr>
-              <w:t>88.2%</w:t>
+              <w:t>86.1%</w:t>
             </w:r>
           </w:p>
         </w:tc>
@@ -9127,7 +9031,7 @@
                 <w:rFonts w:ascii="Cambria" w:hAnsi="Cambria"/>
                 <w:szCs w:val="22"/>
               </w:rPr>
-              <w:t>88.5%</w:t>
+              <w:t>93.4%</w:t>
             </w:r>
           </w:p>
         </w:tc>
@@ -9149,7 +9053,7 @@
                 <w:rFonts w:ascii="Cambria" w:hAnsi="Cambria"/>
                 <w:szCs w:val="22"/>
               </w:rPr>
-              <w:t>50%</w:t>
+              <w:t>75.0%</w:t>
             </w:r>
           </w:p>
         </w:tc>
@@ -9204,7 +9108,7 @@
                 <w:rFonts w:ascii="Cambria" w:hAnsi="Cambria"/>
                 <w:szCs w:val="22"/>
               </w:rPr>
-              <w:t>67.4%</w:t>
+              <w:t>72.3%</w:t>
             </w:r>
           </w:p>
         </w:tc>
@@ -9226,7 +9130,7 @@
                 <w:rFonts w:ascii="Cambria" w:hAnsi="Cambria"/>
                 <w:szCs w:val="22"/>
               </w:rPr>
-              <w:t>77.3%</w:t>
+              <w:t>84.8%</w:t>
             </w:r>
           </w:p>
         </w:tc>
@@ -9331,7 +9235,7 @@
                 <w:rFonts w:ascii="Cambria" w:hAnsi="Cambria"/>
                 <w:szCs w:val="22"/>
               </w:rPr>
-              <w:t>Restore complete (0.9s)</w:t>
+              <w:t>Restore complete (1.0s)</w:t>
             </w:r>
           </w:p>
           <w:p>
@@ -9362,7 +9266,7 @@
                 <w:rFonts w:ascii="Cambria" w:hAnsi="Cambria"/>
                 <w:szCs w:val="22"/>
               </w:rPr>
-              <w:t xml:space="preserve"> net10.0 succeeded (0.1s) → </w:t>
+              <w:t xml:space="preserve"> net10.0 succeeded (0.2s) → </w:t>
             </w:r>
             <w:proofErr w:type="spellStart"/>
             <w:r>
@@ -9487,7 +9391,7 @@
                 <w:rFonts w:ascii="Cambria" w:hAnsi="Cambria"/>
                 <w:szCs w:val="22"/>
               </w:rPr>
-              <w:t xml:space="preserve">[xUnit.net 00:00:00.11]   Discovering: </w:t>
+              <w:t xml:space="preserve">[xUnit.net 00:00:00.12]   Discovering: </w:t>
             </w:r>
             <w:proofErr w:type="spellStart"/>
             <w:r>
@@ -9511,7 +9415,7 @@
                 <w:rFonts w:ascii="Cambria" w:hAnsi="Cambria"/>
                 <w:szCs w:val="22"/>
               </w:rPr>
-              <w:t>[xUnit.net 00:00:00.18]   Discovered</w:t>
+              <w:t>[xUnit.net 00:00:00.19]   Discovered</w:t>
             </w:r>
             <w:proofErr w:type="gramStart"/>
             <w:r>
@@ -9551,7 +9455,7 @@
                 <w:rFonts w:ascii="Cambria" w:hAnsi="Cambria"/>
                 <w:szCs w:val="22"/>
               </w:rPr>
-              <w:t xml:space="preserve">[xUnit.net 00:00:00.21]   Starting:    </w:t>
+              <w:t xml:space="preserve">[xUnit.net 00:00:00.23]   Starting:    </w:t>
             </w:r>
             <w:proofErr w:type="spellStart"/>
             <w:r>
@@ -9575,7 +9479,7 @@
                 <w:rFonts w:ascii="Cambria" w:hAnsi="Cambria"/>
                 <w:szCs w:val="22"/>
               </w:rPr>
-              <w:t xml:space="preserve">[xUnit.net 00:00:00.34]   Finished:    </w:t>
+              <w:t xml:space="preserve">[xUnit.net 00:00:00.65]   Finished:    </w:t>
             </w:r>
             <w:proofErr w:type="spellStart"/>
             <w:r>
@@ -9615,7 +9519,7 @@
                 <w:rFonts w:ascii="Cambria" w:hAnsi="Cambria"/>
                 <w:szCs w:val="22"/>
               </w:rPr>
-              <w:t xml:space="preserve"> test net10.0 succeeded (1.3s)</w:t>
+              <w:t xml:space="preserve"> test net10.0 succeeded (1.6s)</w:t>
             </w:r>
           </w:p>
           <w:p>
@@ -9638,7 +9542,7 @@
                 <w:rFonts w:ascii="Cambria" w:hAnsi="Cambria"/>
                 <w:szCs w:val="22"/>
               </w:rPr>
-              <w:t>Test summary: total: 14, failed: 0, succeeded: 14, skipped: 0, duration: 1.3s</w:t>
+              <w:t>Test summary: total: 28, failed: 0, succeeded: 28, skipped: 0, duration: 1.6s</w:t>
             </w:r>
           </w:p>
           <w:p>
@@ -9653,7 +9557,7 @@
                 <w:rFonts w:ascii="Cambria" w:hAnsi="Cambria"/>
                 <w:szCs w:val="22"/>
               </w:rPr>
-              <w:t>Build succeeded in 2.7s</w:t>
+              <w:t>Build succeeded in 3.2s</w:t>
             </w:r>
           </w:p>
         </w:tc>
@@ -9833,7 +9737,7 @@
                 <w:rFonts w:ascii="Cambria" w:hAnsi="Cambria"/>
                 <w:szCs w:val="22"/>
               </w:rPr>
-              <w:t>14</w:t>
+              <w:t>28</w:t>
             </w:r>
           </w:p>
         </w:tc>
@@ -9855,7 +9759,7 @@
                 <w:rFonts w:ascii="Cambria" w:hAnsi="Cambria"/>
                 <w:szCs w:val="22"/>
               </w:rPr>
-              <w:t>14</w:t>
+              <w:t>28</w:t>
             </w:r>
           </w:p>
         </w:tc>

</xml_diff>